<commit_message>
Match assignment 3 report to assignment 2 format
</commit_message>
<xml_diff>
--- a/assignment-3/Assignment_3_Report.docx
+++ b/assignment-3/Assignment_3_Report.docx
@@ -5,29 +5,53 @@
     <w:p>
       <w:pPr>
         <w:pStyle w:val="Title"/>
+        <w:pageBreakBefore w:val="0"/>
       </w:pPr>
       <w:r>
-        <w:t>Front End Assignment 3 Report</w:t>
+        <w:t>Coffee Shop Assignment 3</w:t>
       </w:r>
     </w:p>
     <w:p>
       <w:r>
-        <w:t>Team DMT  |  Group SE-2509</w:t>
+        <w:t>Topic: Media Queries and Bootstrap Grid</w:t>
       </w:r>
     </w:p>
     <w:p>
       <w:r>
-        <w:t>Yernur Kanapiyauly — Home and About us; Damir Argumbayev — Menu and Contact.</w:t>
+        <w:t>Team name: DMT</w:t>
       </w:r>
     </w:p>
     <w:p>
       <w:r>
-        <w:t>Published assignment site: https://notab123.github.io/coffee-shop/assignment-3/</w:t>
+        <w:t>Group: SE-2509</w:t>
       </w:r>
     </w:p>
     <w:p>
       <w:pPr>
-        <w:pStyle w:val="Heading1"/>
+        <w:pStyle w:val="Heading2"/>
+      </w:pPr>
+      <w:r>
+        <w:t>Members and pages</w:t>
+      </w:r>
+    </w:p>
+    <w:p>
+      <w:r>
+        <w:t>Yernur Kanapiyauly: Home and About us; responsive cards, navigation and carousel.</w:t>
+      </w:r>
+    </w:p>
+    <w:p>
+      <w:r>
+        <w:t>Damir Argumbayev: Menu and Contact; Bootstrap cards, grid and responsive form.</w:t>
+      </w:r>
+    </w:p>
+    <w:p>
+      <w:r>
+        <w:t>Both names appear in the footer of all four pages. The Assignment 2 site remains at the main URL; this work is in a separate assignment-3 copy.</w:t>
+      </w:r>
+    </w:p>
+    <w:p>
+      <w:pPr>
+        <w:pStyle w:val="Heading2"/>
       </w:pPr>
       <w:r>
         <w:t>Objective</w:t>
@@ -35,30 +59,183 @@
     </w:p>
     <w:p>
       <w:r>
-        <w:t>Keep the existing Coffee Shop design and add responsive behaviour with CSS media queries and Bootstrap 5.3. The original website remains available at the main URL; this assignment uses a separate copy.</w:t>
+        <w:t>Make the Coffee Shop pages respond to mobile, tablet and desktop screens using CSS media queries and Bootstrap components while keeping the existing site design.</w:t>
       </w:r>
     </w:p>
     <w:p>
       <w:pPr>
-        <w:pStyle w:val="Heading1"/>
+        <w:pStyle w:val="Heading2"/>
       </w:pPr>
       <w:r>
-        <w:t>Result</w:t>
+        <w:t>Tasks and steps</w:t>
+      </w:r>
+    </w:p>
+    <w:p>
+      <w:pPr>
+        <w:spacing w:after="60"/>
+      </w:pPr>
+      <w:r>
+        <w:rPr>
+          <w:b/>
+        </w:rPr>
+        <w:t xml:space="preserve">Task 1. Responsive typography: </w:t>
+      </w:r>
+      <w:r>
+        <w:t>Set body and heading font sizes at the mobile, tablet (576px) and desktop (992px) breakpoints.</w:t>
+      </w:r>
+    </w:p>
+    <w:p>
+      <w:pPr>
+        <w:spacing w:after="60"/>
+      </w:pPr>
+      <w:r>
+        <w:rPr>
+          <w:b/>
+        </w:rPr>
+        <w:t xml:space="preserve">Task 2. Card group: </w:t>
+      </w:r>
+      <w:r>
+        <w:t>Keep Home cards in a CSS grid: one column on phones, two on tablets and three on desktops.</w:t>
+      </w:r>
+    </w:p>
+    <w:p>
+      <w:pPr>
+        <w:spacing w:after="60"/>
+      </w:pPr>
+      <w:r>
+        <w:rPr>
+          <w:b/>
+        </w:rPr>
+        <w:t xml:space="preserve">Task 3. Bootstrap grid: </w:t>
+      </w:r>
+      <w:r>
+        <w:t>Use container-fluid and responsive rows: two col-lg-6 sections on Contact and three col-lg-4 cards on Menu.</w:t>
+      </w:r>
+    </w:p>
+    <w:p>
+      <w:pPr>
+        <w:spacing w:after="60"/>
+      </w:pPr>
+      <w:r>
+        <w:rPr>
+          <w:b/>
+        </w:rPr>
+        <w:t xml:space="preserve">Task 4. Spacing utilities: </w:t>
+      </w:r>
+      <w:r>
+        <w:t>Use Bootstrap gaps, margin and padding classes on the new grid, cards, carousel and form.</w:t>
+      </w:r>
+    </w:p>
+    <w:p>
+      <w:pPr>
+        <w:spacing w:after="60"/>
+      </w:pPr>
+      <w:r>
+        <w:rPr>
+          <w:b/>
+        </w:rPr>
+        <w:t xml:space="preserve">Task 5. Navigation bar: </w:t>
+      </w:r>
+      <w:r>
+        <w:t>Add four links and a navbar-toggler that opens the collapsed menu on narrow screens.</w:t>
+      </w:r>
+    </w:p>
+    <w:p>
+      <w:pPr>
+        <w:spacing w:after="60"/>
+      </w:pPr>
+      <w:r>
+        <w:rPr>
+          <w:b/>
+        </w:rPr>
+        <w:t xml:space="preserve">Task 6. Buttons: </w:t>
+      </w:r>
+      <w:r>
+        <w:t>Use Bootstrap button styles, sizes, outline buttons and a btn-group on Home.</w:t>
+      </w:r>
+    </w:p>
+    <w:p>
+      <w:pPr>
+        <w:spacing w:after="60"/>
+      </w:pPr>
+      <w:r>
+        <w:rPr>
+          <w:b/>
+        </w:rPr>
+        <w:t xml:space="preserve">Task 7. Carousel: </w:t>
+      </w:r>
+      <w:r>
+        <w:t>Place nine local photographs in the About us carousel with indicators and controls.</w:t>
+      </w:r>
+    </w:p>
+    <w:p>
+      <w:pPr>
+        <w:spacing w:after="60"/>
+      </w:pPr>
+      <w:r>
+        <w:rPr>
+          <w:b/>
+        </w:rPr>
+        <w:t xml:space="preserve">Task 8. Cards: </w:t>
+      </w:r>
+      <w:r>
+        <w:t>Build three image, title and description cards in the Menu grid.</w:t>
+      </w:r>
+    </w:p>
+    <w:p>
+      <w:pPr>
+        <w:spacing w:after="60"/>
+      </w:pPr>
+      <w:r>
+        <w:rPr>
+          <w:b/>
+        </w:rPr>
+        <w:t xml:space="preserve">Task 9. Responsive form: </w:t>
+      </w:r>
+      <w:r>
+        <w:t>Apply form-control, radio and checkbox classes to the Contact form.</w:t>
+      </w:r>
+    </w:p>
+    <w:p>
+      <w:pPr>
+        <w:spacing w:after="60"/>
+      </w:pPr>
+      <w:r>
+        <w:rPr>
+          <w:b/>
+        </w:rPr>
+        <w:t xml:space="preserve">Task 10. Accessibility: </w:t>
+      </w:r>
+      <w:r>
+        <w:t>Keep labels, alternative text, semantic navigation, aria labels and readable contrast.</w:t>
+      </w:r>
+    </w:p>
+    <w:p>
+      <w:pPr>
+        <w:pStyle w:val="Heading2"/>
+      </w:pPr>
+      <w:r>
+        <w:t>Publishing and conclusion</w:t>
       </w:r>
     </w:p>
     <w:p>
       <w:r>
-        <w:t>The four existing pages now include a Bootstrap navbar, responsive grid and cards, buttons, a nine image carousel, and a responsive form. The Home card group uses CSS media queries without Bootstrap grid classes.</w:t>
+        <w:t>The changes were committed and published on GitHub Pages. Desktop and phone screenshots on the following pages show the final result. The original FormSubmit destination was kept; email delivery was not tested.</w:t>
+      </w:r>
+    </w:p>
+    <w:p>
+      <w:r>
+        <w:t>Website: https://notab123.github.io/coffee-shop/assignment-3/</w:t>
       </w:r>
     </w:p>
     <w:p>
       <w:pPr>
-        <w:jc w:val="center"/>
+        <w:spacing w:after="80"/>
       </w:pPr>
       <w:r>
         <w:drawing>
           <wp:inline xmlns:a="http://schemas.openxmlformats.org/drawingml/2006/main" xmlns:pic="http://schemas.openxmlformats.org/drawingml/2006/picture">
-            <wp:extent cx="6172200" cy="3646026"/>
+            <wp:extent cx="5715000" cy="2237014"/>
             <wp:docPr id="1" name="Picture 1"/>
             <wp:cNvGraphicFramePr>
               <a:graphicFrameLocks noChangeAspect="1"/>
@@ -67,11 +244,11 @@
               <a:graphicData uri="http://schemas.openxmlformats.org/drawingml/2006/picture">
                 <pic:pic>
                   <pic:nvPicPr>
-                    <pic:cNvPr id="0" name="report-home.png"/>
+                    <pic:cNvPr id="0" name="code-nav.png"/>
                     <pic:cNvPicPr/>
                   </pic:nvPicPr>
                   <pic:blipFill>
-                    <a:blip r:embed="rId9"/>
+                    <a:blip r:embed="rId10"/>
                     <a:stretch>
                       <a:fillRect/>
                     </a:stretch>
@@ -79,7 +256,7 @@
                   <pic:spPr>
                     <a:xfrm>
                       <a:off x="0" y="0"/>
-                      <a:ext cx="6172200" cy="3646026"/>
+                      <a:ext cx="5715000" cy="2237014"/>
                     </a:xfrm>
                     <a:prstGeom prst="rect"/>
                   </pic:spPr>
@@ -92,59 +269,37 @@
     </w:p>
     <w:p>
       <w:pPr>
-        <w:jc w:val="center"/>
+        <w:spacing w:after="160"/>
       </w:pPr>
       <w:r>
         <w:rPr>
-          <w:i/>
-          <w:sz w:val="16"/>
+          <w:sz w:val="18"/>
         </w:rPr>
-        <w:t>Figure 1  Home page on desktop</w:t>
+        <w:t>HTML code for the collapsible navigation and Bootstrap button group.</w:t>
       </w:r>
     </w:p>
     <w:p>
       <w:pPr>
-        <w:pStyle w:val="Heading1"/>
+        <w:pStyle w:val="Title"/>
         <w:pageBreakBefore/>
       </w:pPr>
       <w:r>
-        <w:t>Part 1 Media Queries</w:t>
+        <w:t>Home</w:t>
+      </w:r>
+    </w:p>
+    <w:p>
+      <w:r>
+        <w:t>Tasks 1, 2, 5 and 6: text sizes change with screen width; the three cards use CSS media queries. The four-link Bootstrap navbar and buttons retain the original colours.</w:t>
       </w:r>
     </w:p>
     <w:p>
       <w:pPr>
-        <w:pStyle w:val="Heading2"/>
-      </w:pPr>
-      <w:r>
-        <w:t>Task 1 Responsive typography</w:t>
-      </w:r>
-    </w:p>
-    <w:p>
-      <w:r>
-        <w:t>We kept the existing headings and paragraphs. In css/style.css, the base sizes are for phones; media queries at 576 px and 992 px increase the font sizes for tablet and desktop.</w:t>
-      </w:r>
-    </w:p>
-    <w:p>
-      <w:pPr>
-        <w:pStyle w:val="Heading2"/>
-      </w:pPr>
-      <w:r>
-        <w:t>Task 2 Three card layout</w:t>
-      </w:r>
-    </w:p>
-    <w:p>
-      <w:r>
-        <w:t>We changed the Home card row to CSS grid. A phone shows one card per row, a tablet shows two, and a desktop shows three. This particular layout does not use Bootstrap grid classes.</w:t>
-      </w:r>
-    </w:p>
-    <w:p>
-      <w:pPr>
-        <w:jc w:val="center"/>
+        <w:spacing w:after="80"/>
       </w:pPr>
       <w:r>
         <w:drawing>
           <wp:inline xmlns:a="http://schemas.openxmlformats.org/drawingml/2006/main" xmlns:pic="http://schemas.openxmlformats.org/drawingml/2006/picture">
-            <wp:extent cx="6080760" cy="1596860"/>
+            <wp:extent cx="5989320" cy="4649937"/>
             <wp:docPr id="2" name="Picture 2"/>
             <wp:cNvGraphicFramePr>
               <a:graphicFrameLocks noChangeAspect="1"/>
@@ -153,11 +308,11 @@
               <a:graphicData uri="http://schemas.openxmlformats.org/drawingml/2006/picture">
                 <pic:pic>
                   <pic:nvPicPr>
-                    <pic:cNvPr id="0" name="code-media.png"/>
+                    <pic:cNvPr id="0" name="a3-home.png"/>
                     <pic:cNvPicPr/>
                   </pic:nvPicPr>
                   <pic:blipFill>
-                    <a:blip r:embed="rId10"/>
+                    <a:blip r:embed="rId11"/>
                     <a:stretch>
                       <a:fillRect/>
                     </a:stretch>
@@ -165,7 +320,7 @@
                   <pic:spPr>
                     <a:xfrm>
                       <a:off x="0" y="0"/>
-                      <a:ext cx="6080760" cy="1596860"/>
+                      <a:ext cx="5989320" cy="4649937"/>
                     </a:xfrm>
                     <a:prstGeom prst="rect"/>
                   </pic:spPr>
@@ -178,38 +333,447 @@
     </w:p>
     <w:p>
       <w:pPr>
-        <w:jc w:val="center"/>
+        <w:spacing w:after="160"/>
       </w:pPr>
       <w:r>
         <w:rPr>
-          <w:i/>
-          <w:sz w:val="16"/>
+          <w:sz w:val="18"/>
         </w:rPr>
-        <w:t>Figure 2  Media query code</w:t>
+        <w:t>Home page at a desktop width of 1200px.</w:t>
+      </w:r>
+    </w:p>
+    <w:p>
+      <w:pPr>
+        <w:spacing w:after="80"/>
+      </w:pPr>
+      <w:r>
+        <w:drawing>
+          <wp:inline xmlns:a="http://schemas.openxmlformats.org/drawingml/2006/main" xmlns:pic="http://schemas.openxmlformats.org/drawingml/2006/picture">
+            <wp:extent cx="5989320" cy="1848133"/>
+            <wp:docPr id="3" name="Picture 3"/>
+            <wp:cNvGraphicFramePr>
+              <a:graphicFrameLocks noChangeAspect="1"/>
+            </wp:cNvGraphicFramePr>
+            <a:graphic>
+              <a:graphicData uri="http://schemas.openxmlformats.org/drawingml/2006/picture">
+                <pic:pic>
+                  <pic:nvPicPr>
+                    <pic:cNvPr id="0" name="code-home.png"/>
+                    <pic:cNvPicPr/>
+                  </pic:nvPicPr>
+                  <pic:blipFill>
+                    <a:blip r:embed="rId12"/>
+                    <a:stretch>
+                      <a:fillRect/>
+                    </a:stretch>
+                  </pic:blipFill>
+                  <pic:spPr>
+                    <a:xfrm>
+                      <a:off x="0" y="0"/>
+                      <a:ext cx="5989320" cy="1848133"/>
+                    </a:xfrm>
+                    <a:prstGeom prst="rect"/>
+                  </pic:spPr>
+                </pic:pic>
+              </a:graphicData>
+            </a:graphic>
+          </wp:inline>
+        </w:drawing>
+      </w:r>
+    </w:p>
+    <w:p>
+      <w:pPr>
+        <w:spacing w:after="160"/>
+      </w:pPr>
+      <w:r>
+        <w:rPr>
+          <w:sz w:val="18"/>
+        </w:rPr>
+        <w:t>CSS code for the card grid and responsive typography.</w:t>
+      </w:r>
+    </w:p>
+    <w:p>
+      <w:pPr>
+        <w:pStyle w:val="Title"/>
+        <w:pageBreakBefore/>
+      </w:pPr>
+      <w:r>
+        <w:t>Menu</w:t>
+      </w:r>
+    </w:p>
+    <w:p>
+      <w:r>
+        <w:t>Tasks 3, 4 and 8: a Bootstrap row uses col-sm-6 and col-lg-4 for the three menu cards. The same page uses Bootstrap spacing classes and a container-fluid wrapper.</w:t>
+      </w:r>
+    </w:p>
+    <w:p>
+      <w:pPr>
+        <w:spacing w:after="80"/>
+      </w:pPr>
+      <w:r>
+        <w:drawing>
+          <wp:inline xmlns:a="http://schemas.openxmlformats.org/drawingml/2006/main" xmlns:pic="http://schemas.openxmlformats.org/drawingml/2006/picture">
+            <wp:extent cx="5440680" cy="5119290"/>
+            <wp:docPr id="4" name="Picture 4"/>
+            <wp:cNvGraphicFramePr>
+              <a:graphicFrameLocks noChangeAspect="1"/>
+            </wp:cNvGraphicFramePr>
+            <a:graphic>
+              <a:graphicData uri="http://schemas.openxmlformats.org/drawingml/2006/picture">
+                <pic:pic>
+                  <pic:nvPicPr>
+                    <pic:cNvPr id="0" name="a3-menu.png"/>
+                    <pic:cNvPicPr/>
+                  </pic:nvPicPr>
+                  <pic:blipFill>
+                    <a:blip r:embed="rId13"/>
+                    <a:stretch>
+                      <a:fillRect/>
+                    </a:stretch>
+                  </pic:blipFill>
+                  <pic:spPr>
+                    <a:xfrm>
+                      <a:off x="0" y="0"/>
+                      <a:ext cx="5440680" cy="5119290"/>
+                    </a:xfrm>
+                    <a:prstGeom prst="rect"/>
+                  </pic:spPr>
+                </pic:pic>
+              </a:graphicData>
+            </a:graphic>
+          </wp:inline>
+        </w:drawing>
+      </w:r>
+    </w:p>
+    <w:p>
+      <w:pPr>
+        <w:spacing w:after="160"/>
+      </w:pPr>
+      <w:r>
+        <w:rPr>
+          <w:sz w:val="18"/>
+        </w:rPr>
+        <w:t>Menu page with three Bootstrap cards and the original drinks table.</w:t>
+      </w:r>
+    </w:p>
+    <w:p>
+      <w:pPr>
+        <w:spacing w:after="80"/>
+      </w:pPr>
+      <w:r>
+        <w:drawing>
+          <wp:inline xmlns:a="http://schemas.openxmlformats.org/drawingml/2006/main" xmlns:pic="http://schemas.openxmlformats.org/drawingml/2006/picture">
+            <wp:extent cx="5989320" cy="1724069"/>
+            <wp:docPr id="5" name="Picture 5"/>
+            <wp:cNvGraphicFramePr>
+              <a:graphicFrameLocks noChangeAspect="1"/>
+            </wp:cNvGraphicFramePr>
+            <a:graphic>
+              <a:graphicData uri="http://schemas.openxmlformats.org/drawingml/2006/picture">
+                <pic:pic>
+                  <pic:nvPicPr>
+                    <pic:cNvPr id="0" name="code-menu.png"/>
+                    <pic:cNvPicPr/>
+                  </pic:nvPicPr>
+                  <pic:blipFill>
+                    <a:blip r:embed="rId14"/>
+                    <a:stretch>
+                      <a:fillRect/>
+                    </a:stretch>
+                  </pic:blipFill>
+                  <pic:spPr>
+                    <a:xfrm>
+                      <a:off x="0" y="0"/>
+                      <a:ext cx="5989320" cy="1724069"/>
+                    </a:xfrm>
+                    <a:prstGeom prst="rect"/>
+                  </pic:spPr>
+                </pic:pic>
+              </a:graphicData>
+            </a:graphic>
+          </wp:inline>
+        </w:drawing>
+      </w:r>
+    </w:p>
+    <w:p>
+      <w:pPr>
+        <w:spacing w:after="160"/>
+      </w:pPr>
+      <w:r>
+        <w:rPr>
+          <w:sz w:val="18"/>
+        </w:rPr>
+        <w:t>HTML code for the responsive card row and its first card.</w:t>
+      </w:r>
+    </w:p>
+    <w:p>
+      <w:pPr>
+        <w:pStyle w:val="Title"/>
+        <w:pageBreakBefore/>
+      </w:pPr>
+      <w:r>
+        <w:t>About us</w:t>
+      </w:r>
+    </w:p>
+    <w:p>
+      <w:r>
+        <w:t>Tasks 5 and 7: the navbar is reused on this page. The carousel contains nine photographs with slide indicators and previous and next controls.</w:t>
+      </w:r>
+    </w:p>
+    <w:p>
+      <w:pPr>
+        <w:spacing w:after="80"/>
+      </w:pPr>
+      <w:r>
+        <w:drawing>
+          <wp:inline xmlns:a="http://schemas.openxmlformats.org/drawingml/2006/main" xmlns:pic="http://schemas.openxmlformats.org/drawingml/2006/picture">
+            <wp:extent cx="5989320" cy="4826836"/>
+            <wp:docPr id="6" name="Picture 6"/>
+            <wp:cNvGraphicFramePr>
+              <a:graphicFrameLocks noChangeAspect="1"/>
+            </wp:cNvGraphicFramePr>
+            <a:graphic>
+              <a:graphicData uri="http://schemas.openxmlformats.org/drawingml/2006/picture">
+                <pic:pic>
+                  <pic:nvPicPr>
+                    <pic:cNvPr id="0" name="a3-about.png"/>
+                    <pic:cNvPicPr/>
+                  </pic:nvPicPr>
+                  <pic:blipFill>
+                    <a:blip r:embed="rId15"/>
+                    <a:stretch>
+                      <a:fillRect/>
+                    </a:stretch>
+                  </pic:blipFill>
+                  <pic:spPr>
+                    <a:xfrm>
+                      <a:off x="0" y="0"/>
+                      <a:ext cx="5989320" cy="4826836"/>
+                    </a:xfrm>
+                    <a:prstGeom prst="rect"/>
+                  </pic:spPr>
+                </pic:pic>
+              </a:graphicData>
+            </a:graphic>
+          </wp:inline>
+        </w:drawing>
+      </w:r>
+    </w:p>
+    <w:p>
+      <w:pPr>
+        <w:spacing w:after="160"/>
+      </w:pPr>
+      <w:r>
+        <w:rPr>
+          <w:sz w:val="18"/>
+        </w:rPr>
+        <w:t>About us page showing the first carousel slide.</w:t>
+      </w:r>
+    </w:p>
+    <w:p>
+      <w:pPr>
+        <w:spacing w:after="80"/>
+      </w:pPr>
+      <w:r>
+        <w:drawing>
+          <wp:inline xmlns:a="http://schemas.openxmlformats.org/drawingml/2006/main" xmlns:pic="http://schemas.openxmlformats.org/drawingml/2006/picture">
+            <wp:extent cx="5989320" cy="3336907"/>
+            <wp:docPr id="7" name="Picture 7"/>
+            <wp:cNvGraphicFramePr>
+              <a:graphicFrameLocks noChangeAspect="1"/>
+            </wp:cNvGraphicFramePr>
+            <a:graphic>
+              <a:graphicData uri="http://schemas.openxmlformats.org/drawingml/2006/picture">
+                <pic:pic>
+                  <pic:nvPicPr>
+                    <pic:cNvPr id="0" name="code-about.png"/>
+                    <pic:cNvPicPr/>
+                  </pic:nvPicPr>
+                  <pic:blipFill>
+                    <a:blip r:embed="rId16"/>
+                    <a:stretch>
+                      <a:fillRect/>
+                    </a:stretch>
+                  </pic:blipFill>
+                  <pic:spPr>
+                    <a:xfrm>
+                      <a:off x="0" y="0"/>
+                      <a:ext cx="5989320" cy="3336907"/>
+                    </a:xfrm>
+                    <a:prstGeom prst="rect"/>
+                  </pic:spPr>
+                </pic:pic>
+              </a:graphicData>
+            </a:graphic>
+          </wp:inline>
+        </w:drawing>
+      </w:r>
+    </w:p>
+    <w:p>
+      <w:pPr>
+        <w:spacing w:after="160"/>
+      </w:pPr>
+      <w:r>
+        <w:rPr>
+          <w:sz w:val="18"/>
+        </w:rPr>
+        <w:t>HTML code for the carousel indicators and first slide.</w:t>
+      </w:r>
+    </w:p>
+    <w:p>
+      <w:pPr>
+        <w:pStyle w:val="Title"/>
+        <w:pageBreakBefore/>
+      </w:pPr>
+      <w:r>
+        <w:t>Contact</w:t>
+      </w:r>
+    </w:p>
+    <w:p>
+      <w:r>
+        <w:t>Tasks 3, 4, 9 and 10: two col-lg-6 sections sit side by side on desktop and stack on phones. Form fields use Bootstrap controls, radio buttons and a checkbox with labels.</w:t>
+      </w:r>
+    </w:p>
+    <w:p>
+      <w:pPr>
+        <w:spacing w:after="80"/>
+      </w:pPr>
+      <w:r>
+        <w:drawing>
+          <wp:inline xmlns:a="http://schemas.openxmlformats.org/drawingml/2006/main" xmlns:pic="http://schemas.openxmlformats.org/drawingml/2006/picture">
+            <wp:extent cx="5989320" cy="4634774"/>
+            <wp:docPr id="8" name="Picture 8"/>
+            <wp:cNvGraphicFramePr>
+              <a:graphicFrameLocks noChangeAspect="1"/>
+            </wp:cNvGraphicFramePr>
+            <a:graphic>
+              <a:graphicData uri="http://schemas.openxmlformats.org/drawingml/2006/picture">
+                <pic:pic>
+                  <pic:nvPicPr>
+                    <pic:cNvPr id="0" name="a3-contact.png"/>
+                    <pic:cNvPicPr/>
+                  </pic:nvPicPr>
+                  <pic:blipFill>
+                    <a:blip r:embed="rId17"/>
+                    <a:stretch>
+                      <a:fillRect/>
+                    </a:stretch>
+                  </pic:blipFill>
+                  <pic:spPr>
+                    <a:xfrm>
+                      <a:off x="0" y="0"/>
+                      <a:ext cx="5989320" cy="4634774"/>
+                    </a:xfrm>
+                    <a:prstGeom prst="rect"/>
+                  </pic:spPr>
+                </pic:pic>
+              </a:graphicData>
+            </a:graphic>
+          </wp:inline>
+        </w:drawing>
+      </w:r>
+    </w:p>
+    <w:p>
+      <w:pPr>
+        <w:spacing w:after="160"/>
+      </w:pPr>
+      <w:r>
+        <w:rPr>
+          <w:sz w:val="18"/>
+        </w:rPr>
+        <w:t>Contact page with the responsive visit information and form.</w:t>
+      </w:r>
+    </w:p>
+    <w:p>
+      <w:pPr>
+        <w:spacing w:after="80"/>
+      </w:pPr>
+      <w:r>
+        <w:drawing>
+          <wp:inline xmlns:a="http://schemas.openxmlformats.org/drawingml/2006/main" xmlns:pic="http://schemas.openxmlformats.org/drawingml/2006/picture">
+            <wp:extent cx="5989320" cy="2096262"/>
+            <wp:docPr id="9" name="Picture 9"/>
+            <wp:cNvGraphicFramePr>
+              <a:graphicFrameLocks noChangeAspect="1"/>
+            </wp:cNvGraphicFramePr>
+            <a:graphic>
+              <a:graphicData uri="http://schemas.openxmlformats.org/drawingml/2006/picture">
+                <pic:pic>
+                  <pic:nvPicPr>
+                    <pic:cNvPr id="0" name="code-contact.png"/>
+                    <pic:cNvPicPr/>
+                  </pic:nvPicPr>
+                  <pic:blipFill>
+                    <a:blip r:embed="rId18"/>
+                    <a:stretch>
+                      <a:fillRect/>
+                    </a:stretch>
+                  </pic:blipFill>
+                  <pic:spPr>
+                    <a:xfrm>
+                      <a:off x="0" y="0"/>
+                      <a:ext cx="5989320" cy="2096262"/>
+                    </a:xfrm>
+                    <a:prstGeom prst="rect"/>
+                  </pic:spPr>
+                </pic:pic>
+              </a:graphicData>
+            </a:graphic>
+          </wp:inline>
+        </w:drawing>
+      </w:r>
+    </w:p>
+    <w:p>
+      <w:pPr>
+        <w:spacing w:after="160"/>
+      </w:pPr>
+      <w:r>
+        <w:rPr>
+          <w:sz w:val="18"/>
+        </w:rPr>
+        <w:t>HTML code for the two-column layout and form controls.</w:t>
+      </w:r>
+    </w:p>
+    <w:p>
+      <w:pPr>
+        <w:pStyle w:val="Title"/>
+        <w:pageBreakBefore/>
+      </w:pPr>
+      <w:r>
+        <w:t>Phone layout</w:t>
+      </w:r>
+    </w:p>
+    <w:p>
+      <w:r>
+        <w:t>Screenshots at a 390px viewport. The Home navigation opens with a hamburger button and the three cards stack vertically. The About us carousel scales to the narrow content area.</w:t>
       </w:r>
     </w:p>
     <w:tbl>
       <w:tblPr>
         <w:tblW w:type="auto" w:w="0"/>
+        <w:jc w:val="center"/>
         <w:tblLayout w:type="fixed"/>
         <w:tblLook w:firstColumn="1" w:firstRow="1" w:lastColumn="0" w:lastRow="0" w:noHBand="0" w:noVBand="1" w:val="04A0"/>
       </w:tblPr>
       <w:tblGrid>
-        <w:gridCol w:w="6480"/>
-        <w:gridCol w:w="2880"/>
+        <w:gridCol w:w="4872"/>
+        <w:gridCol w:w="4872"/>
       </w:tblGrid>
       <w:tr>
         <w:tc>
           <w:tcPr>
-            <w:tcW w:type="dxa" w:w="4997"/>
+            <w:tcW w:type="dxa" w:w="4608"/>
             <w:vAlign w:val="top"/>
           </w:tcPr>
           <w:p>
+            <w:pPr>
+              <w:jc w:val="center"/>
+            </w:pPr>
             <w:r>
               <w:drawing>
                 <wp:inline xmlns:a="http://schemas.openxmlformats.org/drawingml/2006/main" xmlns:pic="http://schemas.openxmlformats.org/drawingml/2006/picture">
-                  <wp:extent cx="3977639" cy="3433553"/>
-                  <wp:docPr id="3" name="Picture 3"/>
+                  <wp:extent cx="1674935" cy="5806440"/>
+                  <wp:docPr id="10" name="Picture 10"/>
                   <wp:cNvGraphicFramePr>
                     <a:graphicFrameLocks noChangeAspect="1"/>
                   </wp:cNvGraphicFramePr>
@@ -217,11 +781,11 @@
                     <a:graphicData uri="http://schemas.openxmlformats.org/drawingml/2006/picture">
                       <pic:pic>
                         <pic:nvPicPr>
-                          <pic:cNvPr id="0" name="report-tablet.png"/>
+                          <pic:cNvPr id="0" name="a3-mobile-home-crop.png"/>
                           <pic:cNvPicPr/>
                         </pic:nvPicPr>
                         <pic:blipFill>
-                          <a:blip r:embed="rId11"/>
+                          <a:blip r:embed="rId19"/>
                           <a:stretch>
                             <a:fillRect/>
                           </a:stretch>
@@ -229,7 +793,7 @@
                         <pic:spPr>
                           <a:xfrm>
                             <a:off x="0" y="0"/>
-                            <a:ext cx="3977639" cy="3433553"/>
+                            <a:ext cx="1674935" cy="5806440"/>
                           </a:xfrm>
                           <a:prstGeom prst="rect"/>
                         </pic:spPr>
@@ -243,15 +807,18 @@
         </w:tc>
         <w:tc>
           <w:tcPr>
-            <w:tcW w:type="dxa" w:w="4997"/>
+            <w:tcW w:type="dxa" w:w="4608"/>
             <w:vAlign w:val="top"/>
           </w:tcPr>
           <w:p>
+            <w:pPr>
+              <w:jc w:val="center"/>
+            </w:pPr>
             <w:r>
               <w:drawing>
                 <wp:inline xmlns:a="http://schemas.openxmlformats.org/drawingml/2006/main" xmlns:pic="http://schemas.openxmlformats.org/drawingml/2006/picture">
-                  <wp:extent cx="1600200" cy="4203192"/>
-                  <wp:docPr id="4" name="Picture 4"/>
+                  <wp:extent cx="1992145" cy="5806440"/>
+                  <wp:docPr id="11" name="Picture 11"/>
                   <wp:cNvGraphicFramePr>
                     <a:graphicFrameLocks noChangeAspect="1"/>
                   </wp:cNvGraphicFramePr>
@@ -259,11 +826,11 @@
                     <a:graphicData uri="http://schemas.openxmlformats.org/drawingml/2006/picture">
                       <pic:pic>
                         <pic:nvPicPr>
-                          <pic:cNvPr id="0" name="report-mobile.png"/>
+                          <pic:cNvPr id="0" name="a3-mobile-about.png"/>
                           <pic:cNvPicPr/>
                         </pic:nvPicPr>
                         <pic:blipFill>
-                          <a:blip r:embed="rId12"/>
+                          <a:blip r:embed="rId20"/>
                           <a:stretch>
                             <a:fillRect/>
                           </a:stretch>
@@ -271,7 +838,7 @@
                         <pic:spPr>
                           <a:xfrm>
                             <a:off x="0" y="0"/>
-                            <a:ext cx="1600200" cy="4203192"/>
+                            <a:ext cx="1992145" cy="5806440"/>
                           </a:xfrm>
                           <a:prstGeom prst="rect"/>
                         </pic:spPr>
@@ -286,418 +853,25 @@
       </w:tr>
     </w:tbl>
     <w:p>
-      <w:r>
-        <w:t>Figure 3  Two columns on tablet and one column on mobile</w:t>
-      </w:r>
-    </w:p>
-    <w:p>
       <w:pPr>
-        <w:pStyle w:val="Heading1"/>
-        <w:pageBreakBefore/>
+        <w:spacing w:after="160"/>
       </w:pPr>
       <w:r>
-        <w:t>Part 2 Bootstrap Layout</w:t>
-      </w:r>
-    </w:p>
-    <w:p>
-      <w:pPr>
-        <w:pStyle w:val="Heading2"/>
-      </w:pPr>
-      <w:r>
-        <w:t>Task 3 Grid</w:t>
+        <w:rPr>
+          <w:sz w:val="18"/>
+        </w:rPr>
+        <w:t>Home (left) and About us (right) on a phone.</w:t>
       </w:r>
     </w:p>
     <w:p>
       <w:r>
-        <w:t>We used Bootstrap containers and rows. Menu cards use col-sm-6 col-lg-4 for three columns on desktop; the Contact section uses col-lg-6 for two columns.</w:t>
-      </w:r>
-    </w:p>
-    <w:p>
-      <w:pPr>
-        <w:pStyle w:val="Heading2"/>
-      </w:pPr>
-      <w:r>
-        <w:t>Task 4 Spacing</w:t>
-      </w:r>
-    </w:p>
-    <w:p>
-      <w:r>
-        <w:t>New sections use Bootstrap spacing classes including g-3, g-4, p-3, mt-4, and mt-lg-4. The original outer page spacing stays close to Assignment 2.</w:t>
-      </w:r>
-    </w:p>
-    <w:p>
-      <w:pPr>
-        <w:pStyle w:val="Heading2"/>
-      </w:pPr>
-      <w:r>
-        <w:t>Task 5 Navigation bar</w:t>
-      </w:r>
-    </w:p>
-    <w:p>
-      <w:r>
-        <w:t>The four page links now use a Bootstrap navbar. The navbar-toggler opens the links on narrower screens.</w:t>
-      </w:r>
-    </w:p>
-    <w:p>
-      <w:pPr>
-        <w:pStyle w:val="Heading2"/>
-      </w:pPr>
-      <w:r>
-        <w:t>Task 6 Buttons</w:t>
-      </w:r>
-    </w:p>
-    <w:p>
-      <w:r>
-        <w:t>Cards and the form use Bootstrap btn classes. The Home page uses a btn-group with primary and outline buttons; small buttons are used on cards.</w:t>
-      </w:r>
-    </w:p>
-    <w:p>
-      <w:pPr>
-        <w:pStyle w:val="Heading2"/>
-      </w:pPr>
-      <w:r>
-        <w:t>Task 8 Cards</w:t>
-      </w:r>
-    </w:p>
-    <w:p>
-      <w:r>
-        <w:t>The Menu page has three Bootstrap cards with an image, title, description, and button.</w:t>
-      </w:r>
-    </w:p>
-    <w:p>
-      <w:pPr>
-        <w:jc w:val="center"/>
-      </w:pPr>
-      <w:r>
-        <w:drawing>
-          <wp:inline xmlns:a="http://schemas.openxmlformats.org/drawingml/2006/main" xmlns:pic="http://schemas.openxmlformats.org/drawingml/2006/picture">
-            <wp:extent cx="6080760" cy="1438232"/>
-            <wp:docPr id="5" name="Picture 5"/>
-            <wp:cNvGraphicFramePr>
-              <a:graphicFrameLocks noChangeAspect="1"/>
-            </wp:cNvGraphicFramePr>
-            <a:graphic>
-              <a:graphicData uri="http://schemas.openxmlformats.org/drawingml/2006/picture">
-                <pic:pic>
-                  <pic:nvPicPr>
-                    <pic:cNvPr id="0" name="code-bootstrap.png"/>
-                    <pic:cNvPicPr/>
-                  </pic:nvPicPr>
-                  <pic:blipFill>
-                    <a:blip r:embed="rId13"/>
-                    <a:stretch>
-                      <a:fillRect/>
-                    </a:stretch>
-                  </pic:blipFill>
-                  <pic:spPr>
-                    <a:xfrm>
-                      <a:off x="0" y="0"/>
-                      <a:ext cx="6080760" cy="1438232"/>
-                    </a:xfrm>
-                    <a:prstGeom prst="rect"/>
-                  </pic:spPr>
-                </pic:pic>
-              </a:graphicData>
-            </a:graphic>
-          </wp:inline>
-        </w:drawing>
-      </w:r>
-    </w:p>
-    <w:p>
-      <w:pPr>
-        <w:jc w:val="center"/>
-      </w:pPr>
-      <w:r>
-        <w:rPr>
-          <w:i/>
-          <w:sz w:val="16"/>
-        </w:rPr>
-        <w:t>Figure 4  Navbar, grid, card, and button source</w:t>
-      </w:r>
-    </w:p>
-    <w:p>
-      <w:pPr>
-        <w:jc w:val="center"/>
-      </w:pPr>
-      <w:r>
-        <w:drawing>
-          <wp:inline xmlns:a="http://schemas.openxmlformats.org/drawingml/2006/main" xmlns:pic="http://schemas.openxmlformats.org/drawingml/2006/picture">
-            <wp:extent cx="6080760" cy="3150653"/>
-            <wp:docPr id="6" name="Picture 6"/>
-            <wp:cNvGraphicFramePr>
-              <a:graphicFrameLocks noChangeAspect="1"/>
-            </wp:cNvGraphicFramePr>
-            <a:graphic>
-              <a:graphicData uri="http://schemas.openxmlformats.org/drawingml/2006/picture">
-                <pic:pic>
-                  <pic:nvPicPr>
-                    <pic:cNvPr id="0" name="report-menu.png"/>
-                    <pic:cNvPicPr/>
-                  </pic:nvPicPr>
-                  <pic:blipFill>
-                    <a:blip r:embed="rId14"/>
-                    <a:stretch>
-                      <a:fillRect/>
-                    </a:stretch>
-                  </pic:blipFill>
-                  <pic:spPr>
-                    <a:xfrm>
-                      <a:off x="0" y="0"/>
-                      <a:ext cx="6080760" cy="3150653"/>
-                    </a:xfrm>
-                    <a:prstGeom prst="rect"/>
-                  </pic:spPr>
-                </pic:pic>
-              </a:graphicData>
-            </a:graphic>
-          </wp:inline>
-        </w:drawing>
-      </w:r>
-    </w:p>
-    <w:p>
-      <w:pPr>
-        <w:jc w:val="center"/>
-      </w:pPr>
-      <w:r>
-        <w:rPr>
-          <w:i/>
-          <w:sz w:val="16"/>
-        </w:rPr>
-        <w:t>Figure 5  Three Bootstrap cards on the Menu page</w:t>
-      </w:r>
-    </w:p>
-    <w:p>
-      <w:pPr>
-        <w:pStyle w:val="Heading1"/>
-        <w:pageBreakBefore/>
-      </w:pPr>
-      <w:r>
-        <w:t>Part 2 Components and Accessibility</w:t>
-      </w:r>
-    </w:p>
-    <w:p>
-      <w:pPr>
-        <w:pStyle w:val="Heading2"/>
-      </w:pPr>
-      <w:r>
-        <w:t>Task 7 Carousel</w:t>
-      </w:r>
-    </w:p>
-    <w:p>
-      <w:r>
-        <w:t>The About page displays nine local photographs in a Bootstrap carousel. It has nine indicators plus previous and next buttons. We tested the next button in the browser.</w:t>
-      </w:r>
-    </w:p>
-    <w:p>
-      <w:pPr>
-        <w:pStyle w:val="Heading2"/>
-      </w:pPr>
-      <w:r>
-        <w:t>Task 9 Form</w:t>
-      </w:r>
-    </w:p>
-    <w:p>
-      <w:r>
-        <w:t>The Contact page uses form-control, form-select, form-check, and a responsive two column layout. It includes labeled text fields, a dropdown, two radio choices, and a checkbox.</w:t>
-      </w:r>
-    </w:p>
-    <w:p>
-      <w:pPr>
-        <w:pStyle w:val="Heading2"/>
-      </w:pPr>
-      <w:r>
-        <w:t>Task 10 Accessibility</w:t>
-      </w:r>
-    </w:p>
-    <w:p>
-      <w:r>
-        <w:t>The pages keep semantic headings, image alternative text, form labels, a labeled navigation region, an active link indicator, and visible focus styling.</w:t>
-      </w:r>
-    </w:p>
-    <w:p>
-      <w:pPr>
-        <w:jc w:val="center"/>
-      </w:pPr>
-      <w:r>
-        <w:drawing>
-          <wp:inline xmlns:a="http://schemas.openxmlformats.org/drawingml/2006/main" xmlns:pic="http://schemas.openxmlformats.org/drawingml/2006/picture">
-            <wp:extent cx="6080760" cy="1438232"/>
-            <wp:docPr id="7" name="Picture 7"/>
-            <wp:cNvGraphicFramePr>
-              <a:graphicFrameLocks noChangeAspect="1"/>
-            </wp:cNvGraphicFramePr>
-            <a:graphic>
-              <a:graphicData uri="http://schemas.openxmlformats.org/drawingml/2006/picture">
-                <pic:pic>
-                  <pic:nvPicPr>
-                    <pic:cNvPr id="0" name="code-components.png"/>
-                    <pic:cNvPicPr/>
-                  </pic:nvPicPr>
-                  <pic:blipFill>
-                    <a:blip r:embed="rId15"/>
-                    <a:stretch>
-                      <a:fillRect/>
-                    </a:stretch>
-                  </pic:blipFill>
-                  <pic:spPr>
-                    <a:xfrm>
-                      <a:off x="0" y="0"/>
-                      <a:ext cx="6080760" cy="1438232"/>
-                    </a:xfrm>
-                    <a:prstGeom prst="rect"/>
-                  </pic:spPr>
-                </pic:pic>
-              </a:graphicData>
-            </a:graphic>
-          </wp:inline>
-        </w:drawing>
-      </w:r>
-    </w:p>
-    <w:p>
-      <w:pPr>
-        <w:jc w:val="center"/>
-      </w:pPr>
-      <w:r>
-        <w:rPr>
-          <w:i/>
-          <w:sz w:val="16"/>
-        </w:rPr>
-        <w:t>Figure 6  Carousel and form source</w:t>
-      </w:r>
-    </w:p>
-    <w:p>
-      <w:pPr>
-        <w:jc w:val="center"/>
-      </w:pPr>
-      <w:r>
-        <w:drawing>
-          <wp:inline xmlns:a="http://schemas.openxmlformats.org/drawingml/2006/main" xmlns:pic="http://schemas.openxmlformats.org/drawingml/2006/picture">
-            <wp:extent cx="5669280" cy="3113698"/>
-            <wp:docPr id="8" name="Picture 8"/>
-            <wp:cNvGraphicFramePr>
-              <a:graphicFrameLocks noChangeAspect="1"/>
-            </wp:cNvGraphicFramePr>
-            <a:graphic>
-              <a:graphicData uri="http://schemas.openxmlformats.org/drawingml/2006/picture">
-                <pic:pic>
-                  <pic:nvPicPr>
-                    <pic:cNvPr id="0" name="report-carousel.png"/>
-                    <pic:cNvPicPr/>
-                  </pic:nvPicPr>
-                  <pic:blipFill>
-                    <a:blip r:embed="rId16"/>
-                    <a:stretch>
-                      <a:fillRect/>
-                    </a:stretch>
-                  </pic:blipFill>
-                  <pic:spPr>
-                    <a:xfrm>
-                      <a:off x="0" y="0"/>
-                      <a:ext cx="5669280" cy="3113698"/>
-                    </a:xfrm>
-                    <a:prstGeom prst="rect"/>
-                  </pic:spPr>
-                </pic:pic>
-              </a:graphicData>
-            </a:graphic>
-          </wp:inline>
-        </w:drawing>
-      </w:r>
-    </w:p>
-    <w:p>
-      <w:pPr>
-        <w:jc w:val="center"/>
-      </w:pPr>
-      <w:r>
-        <w:rPr>
-          <w:i/>
-          <w:sz w:val="16"/>
-        </w:rPr>
-        <w:t>Figure 7  About page carousel with controls and indicators</w:t>
-      </w:r>
-    </w:p>
-    <w:p>
-      <w:pPr>
-        <w:pStyle w:val="Heading1"/>
-        <w:pageBreakBefore/>
-      </w:pPr>
-      <w:r>
-        <w:t>Verification and Reflection</w:t>
-      </w:r>
-    </w:p>
-    <w:p>
-      <w:r>
-        <w:t>Browser checks: the CSS card group rendered 1, 2, and 3 columns at 390, 768, and 1200 px; no horizontal overflow appeared. The mobile menu opened, and the carousel contained nine slides and nine indicators. All four pages loaded with their local images and Bootstrap files.</w:t>
-      </w:r>
-    </w:p>
-    <w:p>
-      <w:pPr>
-        <w:jc w:val="center"/>
-      </w:pPr>
-      <w:r>
-        <w:drawing>
-          <wp:inline xmlns:a="http://schemas.openxmlformats.org/drawingml/2006/main" xmlns:pic="http://schemas.openxmlformats.org/drawingml/2006/picture">
-            <wp:extent cx="3474720" cy="4608576"/>
-            <wp:docPr id="9" name="Picture 9"/>
-            <wp:cNvGraphicFramePr>
-              <a:graphicFrameLocks noChangeAspect="1"/>
-            </wp:cNvGraphicFramePr>
-            <a:graphic>
-              <a:graphicData uri="http://schemas.openxmlformats.org/drawingml/2006/picture">
-                <pic:pic>
-                  <pic:nvPicPr>
-                    <pic:cNvPr id="0" name="report-form.png"/>
-                    <pic:cNvPicPr/>
-                  </pic:nvPicPr>
-                  <pic:blipFill>
-                    <a:blip r:embed="rId17"/>
-                    <a:stretch>
-                      <a:fillRect/>
-                    </a:stretch>
-                  </pic:blipFill>
-                  <pic:spPr>
-                    <a:xfrm>
-                      <a:off x="0" y="0"/>
-                      <a:ext cx="3474720" cy="4608576"/>
-                    </a:xfrm>
-                    <a:prstGeom prst="rect"/>
-                  </pic:spPr>
-                </pic:pic>
-              </a:graphicData>
-            </a:graphic>
-          </wp:inline>
-        </w:drawing>
-      </w:r>
-    </w:p>
-    <w:p>
-      <w:pPr>
-        <w:jc w:val="center"/>
-      </w:pPr>
-      <w:r>
-        <w:rPr>
-          <w:i/>
-          <w:sz w:val="16"/>
-        </w:rPr>
-        <w:t>Figure 8  Contact form with Bootstrap fields</w:t>
-      </w:r>
-    </w:p>
-    <w:p>
-      <w:pPr>
-        <w:pStyle w:val="Heading1"/>
-      </w:pPr>
-      <w:r>
-        <w:t>Reflection</w:t>
-      </w:r>
-    </w:p>
-    <w:p>
-      <w:r>
-        <w:t>Media queries are useful for a specific custom layout, while Bootstrap supplies ready-made grid and controls. Using a separate assignment folder preserved the original Coffee Shop site.</w:t>
+        <w:t>Checks: the pages have no horizontal overflow or missing local images at the tested widths. Navigation links, carousel controls and form labels were checked.</w:t>
       </w:r>
     </w:p>
     <w:sectPr>
-      <w:footerReference w:type="default" r:id="rId18"/>
-      <w:pgSz w:w="12240" w:h="15840"/>
-      <w:pgMar w:top="1037" w:right="1123" w:bottom="936" w:left="1123" w:header="720" w:footer="720" w:gutter="0"/>
+      <w:footerReference w:type="default" r:id="rId9"/>
+      <w:pgSz w:w="11905" w:h="16838"/>
+      <w:pgMar w:top="979" w:right="1080" w:bottom="893" w:left="1080" w:header="360" w:footer="432" w:gutter="0"/>
       <w:cols w:space="720"/>
       <w:docGrid w:linePitch="360"/>
     </w:sectPr>
@@ -713,8 +887,12 @@
       <w:jc w:val="right"/>
     </w:pPr>
     <w:r>
-      <w:t>DMT  |  SE-2509</w:t>
+      <w:rPr>
+        <w:rFonts w:ascii="Arial" w:hAnsi="Arial"/>
+        <w:sz w:val="18"/>
+      </w:rPr>
     </w:r>
+    <w:fldSimple w:instr="PAGE"/>
   </w:p>
 </w:ftr>
 </file>
@@ -1083,12 +1261,12 @@
     <w:qFormat/>
     <w:rsid w:val="00FC693F"/>
     <w:pPr>
-      <w:spacing w:after="120" w:line="269" w:lineRule="auto"/>
+      <w:spacing w:after="100" w:line="252" w:lineRule="auto"/>
     </w:pPr>
     <w:rPr>
       <w:rFonts w:ascii="Arial" w:hAnsi="Arial"/>
-      <w:color w:val="1E1E1E"/>
-      <w:sz w:val="20"/>
+      <w:color w:val="000000"/>
+      <w:sz w:val="21"/>
     </w:rPr>
   </w:style>
   <w:style w:type="paragraph" w:styleId="Header">
@@ -1146,14 +1324,14 @@
     <w:pPr>
       <w:keepNext/>
       <w:keepLines/>
-      <w:spacing w:before="180" w:after="100"/>
+      <w:spacing w:before="480" w:after="0"/>
       <w:outlineLvl w:val="0"/>
     </w:pPr>
     <w:rPr>
-      <w:rFonts w:asciiTheme="majorHAnsi" w:eastAsiaTheme="majorEastAsia" w:hAnsiTheme="majorHAnsi" w:cstheme="majorBidi" w:ascii="Arial" w:hAnsi="Arial"/>
+      <w:rFonts w:asciiTheme="majorHAnsi" w:eastAsiaTheme="majorEastAsia" w:hAnsiTheme="majorHAnsi" w:cstheme="majorBidi"/>
       <w:b/>
       <w:bCs/>
-      <w:color w:val="000000"/>
+      <w:color w:val="365F91" w:themeColor="accent1" w:themeShade="BF"/>
       <w:sz w:val="28"/>
       <w:szCs w:val="28"/>
     </w:rPr>
@@ -1170,7 +1348,7 @@
     <w:pPr>
       <w:keepNext/>
       <w:keepLines/>
-      <w:spacing w:before="180" w:after="100"/>
+      <w:spacing w:before="140" w:after="60"/>
       <w:outlineLvl w:val="1"/>
     </w:pPr>
     <w:rPr>
@@ -1178,7 +1356,7 @@
       <w:b/>
       <w:bCs/>
       <w:color w:val="000000"/>
-      <w:sz w:val="22"/>
+      <w:sz w:val="23"/>
       <w:szCs w:val="26"/>
     </w:rPr>
   </w:style>
@@ -1432,7 +1610,7 @@
     <w:qFormat/>
     <w:rsid w:val="00FC693F"/>
     <w:pPr>
-      <w:spacing w:after="100" w:line="240" w:lineRule="auto" w:before="180"/>
+      <w:spacing w:after="200" w:line="240" w:lineRule="auto"/>
       <w:contextualSpacing/>
     </w:pPr>
     <w:rPr>
@@ -1441,7 +1619,7 @@
       <w:color w:val="000000"/>
       <w:spacing w:val="5"/>
       <w:kern w:val="28"/>
-      <w:sz w:val="38"/>
+      <w:sz w:val="32"/>
       <w:szCs w:val="52"/>
     </w:rPr>
   </w:style>

</xml_diff>